<commit_message>
Cambios a pedido del tutor
</commit_message>
<xml_diff>
--- a/Informes/Informe Inclu-IA - Patricio garces.docx
+++ b/Informes/Informe Inclu-IA - Patricio garces.docx
@@ -26,22 +26,30 @@
           </w:pPr>
           <w:r>
             <w:rPr>
-              <w:noProof/>
-              <w:lang w:val="en-US" w:eastAsia="en-US"/>
+              <w:rFonts w:eastAsiaTheme="minorHAnsi"/>
+              <w:lang w:eastAsia="en-US"/>
             </w:rPr>
             <w:drawing>
-              <wp:anchor distT="0" distB="0" distL="114300" distR="114300" simplePos="0" relativeHeight="251663360" behindDoc="0" locked="0" layoutInCell="1" allowOverlap="1" wp14:anchorId="1ABFA845" wp14:editId="45A71CCF">
+              <wp:anchor distT="0" distB="0" distL="114300" distR="114300" simplePos="0" relativeHeight="251666432" behindDoc="1" locked="0" layoutInCell="1" allowOverlap="1" wp14:anchorId="7062A83A" wp14:editId="54D31EC4">
                 <wp:simplePos x="0" y="0"/>
                 <wp:positionH relativeFrom="margin">
-                  <wp:posOffset>5029835</wp:posOffset>
+                  <wp:posOffset>-198402</wp:posOffset>
                 </wp:positionH>
                 <wp:positionV relativeFrom="margin">
-                  <wp:posOffset>-485775</wp:posOffset>
+                  <wp:posOffset>-412115</wp:posOffset>
                 </wp:positionV>
-                <wp:extent cx="922655" cy="1257935"/>
-                <wp:effectExtent l="0" t="0" r="0" b="0"/>
-                <wp:wrapSquare wrapText="bothSides"/>
-                <wp:docPr id="35" name="Imagen 4"/>
+                <wp:extent cx="2179320" cy="1001395"/>
+                <wp:effectExtent l="0" t="0" r="0" b="8255"/>
+                <wp:wrapTight wrapText="bothSides">
+                  <wp:wrapPolygon edited="0">
+                    <wp:start x="0" y="0"/>
+                    <wp:lineTo x="0" y="21367"/>
+                    <wp:lineTo x="21336" y="21367"/>
+                    <wp:lineTo x="21336" y="0"/>
+                    <wp:lineTo x="0" y="0"/>
+                  </wp:wrapPolygon>
+                </wp:wrapTight>
+                <wp:docPr id="1312042158" name="Imagen 1"/>
                 <wp:cNvGraphicFramePr>
                   <a:graphicFrameLocks xmlns:a="http://schemas.openxmlformats.org/drawingml/2006/main" noChangeAspect="1"/>
                 </wp:cNvGraphicFramePr>
@@ -49,13 +57,11 @@
                   <a:graphicData uri="http://schemas.openxmlformats.org/drawingml/2006/picture">
                     <pic:pic xmlns:pic="http://schemas.openxmlformats.org/drawingml/2006/picture">
                       <pic:nvPicPr>
-                        <pic:cNvPr id="5" name="Imagen 4"/>
-                        <pic:cNvPicPr>
-                          <a:picLocks noChangeAspect="1"/>
-                        </pic:cNvPicPr>
+                        <pic:cNvPr id="1312042158" name=""/>
+                        <pic:cNvPicPr/>
                       </pic:nvPicPr>
                       <pic:blipFill>
-                        <a:blip r:embed="rId8" cstate="print">
+                        <a:blip r:embed="rId8">
                           <a:extLst>
                             <a:ext uri="{28A0092B-C50C-407E-A947-70E740481C1C}">
                               <a14:useLocalDpi xmlns:a14="http://schemas.microsoft.com/office/drawing/2010/main" val="0"/>
@@ -69,42 +75,42 @@
                       <pic:spPr>
                         <a:xfrm>
                           <a:off x="0" y="0"/>
-                          <a:ext cx="922655" cy="1257935"/>
+                          <a:ext cx="2179320" cy="1001395"/>
                         </a:xfrm>
                         <a:prstGeom prst="rect">
                           <a:avLst/>
                         </a:prstGeom>
-                        <a:ln>
-                          <a:noFill/>
-                        </a:ln>
-                        <a:effectLst>
-                          <a:softEdge rad="112500"/>
-                        </a:effectLst>
                       </pic:spPr>
                     </pic:pic>
                   </a:graphicData>
                 </a:graphic>
+                <wp14:sizeRelH relativeFrom="margin">
+                  <wp14:pctWidth>0</wp14:pctWidth>
+                </wp14:sizeRelH>
+                <wp14:sizeRelV relativeFrom="margin">
+                  <wp14:pctHeight>0</wp14:pctHeight>
+                </wp14:sizeRelV>
               </wp:anchor>
             </w:drawing>
           </w:r>
           <w:r>
             <w:rPr>
-              <w:noProof/>
-              <w:lang w:val="en-US" w:eastAsia="en-US"/>
+              <w:rFonts w:eastAsiaTheme="minorHAnsi"/>
+              <w:lang w:eastAsia="en-US"/>
             </w:rPr>
             <w:drawing>
-              <wp:anchor distT="0" distB="0" distL="114300" distR="114300" simplePos="0" relativeHeight="251662336" behindDoc="0" locked="0" layoutInCell="1" allowOverlap="1" wp14:anchorId="3708FE73" wp14:editId="6F166607">
+              <wp:anchor distT="0" distB="0" distL="114300" distR="114300" simplePos="0" relativeHeight="251667456" behindDoc="0" locked="0" layoutInCell="1" allowOverlap="1" wp14:anchorId="63E6F4A4" wp14:editId="195673C2">
                 <wp:simplePos x="0" y="0"/>
                 <wp:positionH relativeFrom="margin">
-                  <wp:align>left</wp:align>
+                  <wp:posOffset>3377565</wp:posOffset>
                 </wp:positionH>
                 <wp:positionV relativeFrom="margin">
-                  <wp:posOffset>-447675</wp:posOffset>
+                  <wp:posOffset>-404495</wp:posOffset>
                 </wp:positionV>
-                <wp:extent cx="922655" cy="1257935"/>
-                <wp:effectExtent l="0" t="0" r="0" b="0"/>
+                <wp:extent cx="2833200" cy="1051200"/>
+                <wp:effectExtent l="0" t="0" r="5715" b="0"/>
                 <wp:wrapSquare wrapText="bothSides"/>
-                <wp:docPr id="34" name="Imagen 3"/>
+                <wp:docPr id="793671303" name="Imagen 1"/>
                 <wp:cNvGraphicFramePr>
                   <a:graphicFrameLocks xmlns:a="http://schemas.openxmlformats.org/drawingml/2006/main" noChangeAspect="1"/>
                 </wp:cNvGraphicFramePr>
@@ -112,13 +118,11 @@
                   <a:graphicData uri="http://schemas.openxmlformats.org/drawingml/2006/picture">
                     <pic:pic xmlns:pic="http://schemas.openxmlformats.org/drawingml/2006/picture">
                       <pic:nvPicPr>
-                        <pic:cNvPr id="4" name="Imagen 3"/>
-                        <pic:cNvPicPr>
-                          <a:picLocks noChangeAspect="1"/>
-                        </pic:cNvPicPr>
+                        <pic:cNvPr id="793671303" name=""/>
+                        <pic:cNvPicPr/>
                       </pic:nvPicPr>
                       <pic:blipFill>
-                        <a:blip r:embed="rId9" cstate="print">
+                        <a:blip r:embed="rId9">
                           <a:extLst>
                             <a:ext uri="{28A0092B-C50C-407E-A947-70E740481C1C}">
                               <a14:useLocalDpi xmlns:a14="http://schemas.microsoft.com/office/drawing/2010/main" val="0"/>
@@ -132,21 +136,21 @@
                       <pic:spPr>
                         <a:xfrm>
                           <a:off x="0" y="0"/>
-                          <a:ext cx="922655" cy="1257935"/>
+                          <a:ext cx="2833200" cy="1051200"/>
                         </a:xfrm>
                         <a:prstGeom prst="rect">
                           <a:avLst/>
                         </a:prstGeom>
-                        <a:ln>
-                          <a:noFill/>
-                        </a:ln>
-                        <a:effectLst>
-                          <a:softEdge rad="112500"/>
-                        </a:effectLst>
                       </pic:spPr>
                     </pic:pic>
                   </a:graphicData>
                 </a:graphic>
+                <wp14:sizeRelH relativeFrom="margin">
+                  <wp14:pctWidth>0</wp14:pctWidth>
+                </wp14:sizeRelH>
+                <wp14:sizeRelV relativeFrom="margin">
+                  <wp14:pctHeight>0</wp14:pctHeight>
+                </wp14:sizeRelV>
               </wp:anchor>
             </w:drawing>
           </w:r>
@@ -158,7 +162,7 @@
             <mc:AlternateContent>
               <mc:Choice Requires="wpg">
                 <w:drawing>
-                  <wp:anchor distT="0" distB="0" distL="114300" distR="114300" simplePos="0" relativeHeight="251659264" behindDoc="1" locked="0" layoutInCell="1" allowOverlap="1" wp14:anchorId="49551C18" wp14:editId="6123A0CE">
+                  <wp:anchor distT="0" distB="0" distL="114300" distR="114300" simplePos="0" relativeHeight="251659264" behindDoc="1" locked="0" layoutInCell="1" allowOverlap="1" wp14:anchorId="49551C18" wp14:editId="2F675240">
                     <wp:simplePos x="0" y="0"/>
                     <mc:AlternateContent>
                       <mc:Choice Requires="wp14">
@@ -4054,7 +4058,27 @@
                                         <w:sz w:val="72"/>
                                         <w:szCs w:val="72"/>
                                       </w:rPr>
-                                      <w:t>Desarrollo Frontend para Sistema de Subtitulado en Tiempo Real</w:t>
+                                      <w:t xml:space="preserve">Desarrollo </w:t>
+                                    </w:r>
+                                    <w:proofErr w:type="spellStart"/>
+                                    <w:r>
+                                      <w:rPr>
+                                        <w:rFonts w:asciiTheme="majorHAnsi" w:eastAsiaTheme="majorEastAsia" w:hAnsiTheme="majorHAnsi" w:cstheme="majorBidi"/>
+                                        <w:color w:val="262626" w:themeColor="text1" w:themeTint="D9"/>
+                                        <w:sz w:val="72"/>
+                                        <w:szCs w:val="72"/>
+                                      </w:rPr>
+                                      <w:t>Frontend</w:t>
+                                    </w:r>
+                                    <w:proofErr w:type="spellEnd"/>
+                                    <w:r>
+                                      <w:rPr>
+                                        <w:rFonts w:asciiTheme="majorHAnsi" w:eastAsiaTheme="majorEastAsia" w:hAnsiTheme="majorHAnsi" w:cstheme="majorBidi"/>
+                                        <w:color w:val="262626" w:themeColor="text1" w:themeTint="D9"/>
+                                        <w:sz w:val="72"/>
+                                        <w:szCs w:val="72"/>
+                                      </w:rPr>
+                                      <w:t xml:space="preserve"> para Sistema de Subtitulado en Tiempo Real</w:t>
                                     </w:r>
                                   </w:sdtContent>
                                 </w:sdt>
@@ -4248,7 +4272,27 @@
                                   <w:sz w:val="72"/>
                                   <w:szCs w:val="72"/>
                                 </w:rPr>
-                                <w:t>Desarrollo Frontend para Sistema de Subtitulado en Tiempo Real</w:t>
+                                <w:t xml:space="preserve">Desarrollo </w:t>
+                              </w:r>
+                              <w:proofErr w:type="spellStart"/>
+                              <w:r>
+                                <w:rPr>
+                                  <w:rFonts w:asciiTheme="majorHAnsi" w:eastAsiaTheme="majorEastAsia" w:hAnsiTheme="majorHAnsi" w:cstheme="majorBidi"/>
+                                  <w:color w:val="262626" w:themeColor="text1" w:themeTint="D9"/>
+                                  <w:sz w:val="72"/>
+                                  <w:szCs w:val="72"/>
+                                </w:rPr>
+                                <w:t>Frontend</w:t>
+                              </w:r>
+                              <w:proofErr w:type="spellEnd"/>
+                              <w:r>
+                                <w:rPr>
+                                  <w:rFonts w:asciiTheme="majorHAnsi" w:eastAsiaTheme="majorEastAsia" w:hAnsiTheme="majorHAnsi" w:cstheme="majorBidi"/>
+                                  <w:color w:val="262626" w:themeColor="text1" w:themeTint="D9"/>
+                                  <w:sz w:val="72"/>
+                                  <w:szCs w:val="72"/>
+                                </w:rPr>
+                                <w:t xml:space="preserve"> para Sistema de Subtitulado en Tiempo Real</w:t>
                               </w:r>
                             </w:sdtContent>
                           </w:sdt>
@@ -4453,6 +4497,102 @@
         </w:p>
         <w:p>
           <w:pPr>
+            <w:pStyle w:val="TDC2"/>
+            <w:tabs>
+              <w:tab w:val="right" w:leader="dot" w:pos="8494"/>
+            </w:tabs>
+            <w:rPr>
+              <w:rFonts w:asciiTheme="minorHAnsi" w:eastAsiaTheme="minorEastAsia" w:hAnsiTheme="minorHAnsi" w:cstheme="minorBidi"/>
+              <w:noProof/>
+              <w:kern w:val="2"/>
+              <w:sz w:val="24"/>
+              <w:szCs w:val="24"/>
+              <w:lang w:eastAsia="es-AR"/>
+              <w14:ligatures w14:val="standardContextual"/>
+            </w:rPr>
+          </w:pPr>
+          <w:r>
+            <w:rPr>
+              <w:noProof/>
+              <w:szCs w:val="24"/>
+              <w:lang w:val="es-ES"/>
+            </w:rPr>
+            <w:fldChar w:fldCharType="begin"/>
+          </w:r>
+          <w:r>
+            <w:rPr>
+              <w:szCs w:val="24"/>
+            </w:rPr>
+            <w:instrText xml:space="preserve"> TOC \o "1-3" \h \z \u </w:instrText>
+          </w:r>
+          <w:r>
+            <w:rPr>
+              <w:noProof/>
+              <w:szCs w:val="24"/>
+              <w:lang w:val="es-ES"/>
+            </w:rPr>
+            <w:fldChar w:fldCharType="separate"/>
+          </w:r>
+          <w:hyperlink w:anchor="_Toc232682697" w:history="1">
+            <w:r>
+              <w:rPr>
+                <w:rStyle w:val="Hipervnculo"/>
+                <w:noProof/>
+              </w:rPr>
+              <w:t>Hoja reservada para la corrección del tutor académico</w:t>
+            </w:r>
+            <w:r>
+              <w:rPr>
+                <w:noProof/>
+                <w:webHidden/>
+              </w:rPr>
+              <w:tab/>
+            </w:r>
+            <w:r>
+              <w:rPr>
+                <w:noProof/>
+                <w:webHidden/>
+              </w:rPr>
+              <w:fldChar w:fldCharType="begin"/>
+            </w:r>
+            <w:r>
+              <w:rPr>
+                <w:noProof/>
+                <w:webHidden/>
+              </w:rPr>
+              <w:instrText xml:space="preserve"> PAGEREF _Toc232682697 \h </w:instrText>
+            </w:r>
+            <w:r>
+              <w:rPr>
+                <w:noProof/>
+                <w:webHidden/>
+              </w:rPr>
+            </w:r>
+            <w:r>
+              <w:rPr>
+                <w:noProof/>
+                <w:webHidden/>
+              </w:rPr>
+              <w:fldChar w:fldCharType="separate"/>
+            </w:r>
+            <w:r>
+              <w:rPr>
+                <w:noProof/>
+                <w:webHidden/>
+              </w:rPr>
+              <w:t>2</w:t>
+            </w:r>
+            <w:r>
+              <w:rPr>
+                <w:noProof/>
+                <w:webHidden/>
+              </w:rPr>
+              <w:fldChar w:fldCharType="end"/>
+            </w:r>
+          </w:hyperlink>
+        </w:p>
+        <w:p>
+          <w:pPr>
             <w:pStyle w:val="TDC1"/>
             <w:rPr>
               <w:rFonts w:asciiTheme="minorHAnsi" w:eastAsiaTheme="minorEastAsia" w:hAnsiTheme="minorHAnsi" w:cstheme="minorBidi"/>
@@ -4464,25 +4604,7 @@
               <w14:ligatures w14:val="standardContextual"/>
             </w:rPr>
           </w:pPr>
-          <w:r>
-            <w:rPr>
-              <w:szCs w:val="24"/>
-            </w:rPr>
-            <w:fldChar w:fldCharType="begin"/>
-          </w:r>
-          <w:r>
-            <w:rPr>
-              <w:szCs w:val="24"/>
-            </w:rPr>
-            <w:instrText xml:space="preserve"> TOC \o "1-3" \h \z \u </w:instrText>
-          </w:r>
-          <w:r>
-            <w:rPr>
-              <w:szCs w:val="24"/>
-            </w:rPr>
-            <w:fldChar w:fldCharType="separate"/>
-          </w:r>
-          <w:hyperlink w:anchor="_Toc232623061" w:history="1">
+          <w:hyperlink w:anchor="_Toc232682698" w:history="1">
             <w:r>
               <w:rPr>
                 <w:rStyle w:val="Hipervnculo"/>
@@ -4505,7 +4627,7 @@
               <w:rPr>
                 <w:webHidden/>
               </w:rPr>
-              <w:instrText xml:space="preserve"> PAGEREF _Toc232623061 \h </w:instrText>
+              <w:instrText xml:space="preserve"> PAGEREF _Toc232682698 \h </w:instrText>
             </w:r>
             <w:r>
               <w:rPr>
@@ -4522,7 +4644,7 @@
               <w:rPr>
                 <w:webHidden/>
               </w:rPr>
-              <w:t>2</w:t>
+              <w:t>3</w:t>
             </w:r>
             <w:r>
               <w:rPr>
@@ -4548,7 +4670,7 @@
               <w14:ligatures w14:val="standardContextual"/>
             </w:rPr>
           </w:pPr>
-          <w:hyperlink w:anchor="_Toc232623062" w:history="1">
+          <w:hyperlink w:anchor="_Toc232682699" w:history="1">
             <w:r>
               <w:rPr>
                 <w:rStyle w:val="Hipervnculo"/>
@@ -4575,7 +4697,7 @@
                 <w:noProof/>
                 <w:webHidden/>
               </w:rPr>
-              <w:instrText xml:space="preserve"> PAGEREF _Toc232623062 \h </w:instrText>
+              <w:instrText xml:space="preserve"> PAGEREF _Toc232682699 \h </w:instrText>
             </w:r>
             <w:r>
               <w:rPr>
@@ -4595,7 +4717,7 @@
                 <w:noProof/>
                 <w:webHidden/>
               </w:rPr>
-              <w:t>2</w:t>
+              <w:t>3</w:t>
             </w:r>
             <w:r>
               <w:rPr>
@@ -4622,7 +4744,7 @@
               <w14:ligatures w14:val="standardContextual"/>
             </w:rPr>
           </w:pPr>
-          <w:hyperlink w:anchor="_Toc232623063" w:history="1">
+          <w:hyperlink w:anchor="_Toc232682700" w:history="1">
             <w:r>
               <w:rPr>
                 <w:rStyle w:val="Hipervnculo"/>
@@ -4649,7 +4771,7 @@
                 <w:noProof/>
                 <w:webHidden/>
               </w:rPr>
-              <w:instrText xml:space="preserve"> PAGEREF _Toc232623063 \h </w:instrText>
+              <w:instrText xml:space="preserve"> PAGEREF _Toc232682700 \h </w:instrText>
             </w:r>
             <w:r>
               <w:rPr>
@@ -4669,7 +4791,7 @@
                 <w:noProof/>
                 <w:webHidden/>
               </w:rPr>
-              <w:t>3</w:t>
+              <w:t>4</w:t>
             </w:r>
             <w:r>
               <w:rPr>
@@ -4696,7 +4818,7 @@
               <w14:ligatures w14:val="standardContextual"/>
             </w:rPr>
           </w:pPr>
-          <w:hyperlink w:anchor="_Toc232623064" w:history="1">
+          <w:hyperlink w:anchor="_Toc232682701" w:history="1">
             <w:r>
               <w:rPr>
                 <w:rStyle w:val="Hipervnculo"/>
@@ -4723,7 +4845,7 @@
                 <w:noProof/>
                 <w:webHidden/>
               </w:rPr>
-              <w:instrText xml:space="preserve"> PAGEREF _Toc232623064 \h </w:instrText>
+              <w:instrText xml:space="preserve"> PAGEREF _Toc232682701 \h </w:instrText>
             </w:r>
             <w:r>
               <w:rPr>
@@ -4743,7 +4865,7 @@
                 <w:noProof/>
                 <w:webHidden/>
               </w:rPr>
-              <w:t>3</w:t>
+              <w:t>4</w:t>
             </w:r>
             <w:r>
               <w:rPr>
@@ -4770,7 +4892,7 @@
               <w14:ligatures w14:val="standardContextual"/>
             </w:rPr>
           </w:pPr>
-          <w:hyperlink w:anchor="_Toc232623065" w:history="1">
+          <w:hyperlink w:anchor="_Toc232682702" w:history="1">
             <w:r>
               <w:rPr>
                 <w:rStyle w:val="Hipervnculo"/>
@@ -4797,7 +4919,7 @@
                 <w:noProof/>
                 <w:webHidden/>
               </w:rPr>
-              <w:instrText xml:space="preserve"> PAGEREF _Toc232623065 \h </w:instrText>
+              <w:instrText xml:space="preserve"> PAGEREF _Toc232682702 \h </w:instrText>
             </w:r>
             <w:r>
               <w:rPr>
@@ -4817,7 +4939,7 @@
                 <w:noProof/>
                 <w:webHidden/>
               </w:rPr>
-              <w:t>3</w:t>
+              <w:t>4</w:t>
             </w:r>
             <w:r>
               <w:rPr>
@@ -4844,7 +4966,7 @@
               <w14:ligatures w14:val="standardContextual"/>
             </w:rPr>
           </w:pPr>
-          <w:hyperlink w:anchor="_Toc232623066" w:history="1">
+          <w:hyperlink w:anchor="_Toc232682703" w:history="1">
             <w:r>
               <w:rPr>
                 <w:rStyle w:val="Hipervnculo"/>
@@ -4871,7 +4993,7 @@
                 <w:noProof/>
                 <w:webHidden/>
               </w:rPr>
-              <w:instrText xml:space="preserve"> PAGEREF _Toc232623066 \h </w:instrText>
+              <w:instrText xml:space="preserve"> PAGEREF _Toc232682703 \h </w:instrText>
             </w:r>
             <w:r>
               <w:rPr>
@@ -4891,7 +5013,7 @@
                 <w:noProof/>
                 <w:webHidden/>
               </w:rPr>
-              <w:t>4</w:t>
+              <w:t>5</w:t>
             </w:r>
             <w:r>
               <w:rPr>
@@ -4918,7 +5040,7 @@
               <w14:ligatures w14:val="standardContextual"/>
             </w:rPr>
           </w:pPr>
-          <w:hyperlink w:anchor="_Toc232623067" w:history="1">
+          <w:hyperlink w:anchor="_Toc232682704" w:history="1">
             <w:r>
               <w:rPr>
                 <w:rStyle w:val="Hipervnculo"/>
@@ -4945,7 +5067,7 @@
                 <w:noProof/>
                 <w:webHidden/>
               </w:rPr>
-              <w:instrText xml:space="preserve"> PAGEREF _Toc232623067 \h </w:instrText>
+              <w:instrText xml:space="preserve"> PAGEREF _Toc232682704 \h </w:instrText>
             </w:r>
             <w:r>
               <w:rPr>
@@ -4965,7 +5087,7 @@
                 <w:noProof/>
                 <w:webHidden/>
               </w:rPr>
-              <w:t>5</w:t>
+              <w:t>6</w:t>
             </w:r>
             <w:r>
               <w:rPr>
@@ -4992,7 +5114,7 @@
               <w14:ligatures w14:val="standardContextual"/>
             </w:rPr>
           </w:pPr>
-          <w:hyperlink w:anchor="_Toc232623068" w:history="1">
+          <w:hyperlink w:anchor="_Toc232682705" w:history="1">
             <w:r>
               <w:rPr>
                 <w:rStyle w:val="Hipervnculo"/>
@@ -5019,7 +5141,7 @@
                 <w:noProof/>
                 <w:webHidden/>
               </w:rPr>
-              <w:instrText xml:space="preserve"> PAGEREF _Toc232623068 \h </w:instrText>
+              <w:instrText xml:space="preserve"> PAGEREF _Toc232682705 \h </w:instrText>
             </w:r>
             <w:r>
               <w:rPr>
@@ -5039,7 +5161,7 @@
                 <w:noProof/>
                 <w:webHidden/>
               </w:rPr>
-              <w:t>5</w:t>
+              <w:t>6</w:t>
             </w:r>
             <w:r>
               <w:rPr>
@@ -5066,7 +5188,7 @@
               <w14:ligatures w14:val="standardContextual"/>
             </w:rPr>
           </w:pPr>
-          <w:hyperlink w:anchor="_Toc232623069" w:history="1">
+          <w:hyperlink w:anchor="_Toc232682706" w:history="1">
             <w:r>
               <w:rPr>
                 <w:rStyle w:val="Hipervnculo"/>
@@ -5093,7 +5215,7 @@
                 <w:noProof/>
                 <w:webHidden/>
               </w:rPr>
-              <w:instrText xml:space="preserve"> PAGEREF _Toc232623069 \h </w:instrText>
+              <w:instrText xml:space="preserve"> PAGEREF _Toc232682706 \h </w:instrText>
             </w:r>
             <w:r>
               <w:rPr>
@@ -5113,7 +5235,7 @@
                 <w:noProof/>
                 <w:webHidden/>
               </w:rPr>
-              <w:t>5</w:t>
+              <w:t>6</w:t>
             </w:r>
             <w:r>
               <w:rPr>
@@ -5140,7 +5262,7 @@
               <w14:ligatures w14:val="standardContextual"/>
             </w:rPr>
           </w:pPr>
-          <w:hyperlink w:anchor="_Toc232623070" w:history="1">
+          <w:hyperlink w:anchor="_Toc232682707" w:history="1">
             <w:r>
               <w:rPr>
                 <w:rStyle w:val="Hipervnculo"/>
@@ -5167,7 +5289,7 @@
                 <w:noProof/>
                 <w:webHidden/>
               </w:rPr>
-              <w:instrText xml:space="preserve"> PAGEREF _Toc232623070 \h </w:instrText>
+              <w:instrText xml:space="preserve"> PAGEREF _Toc232682707 \h </w:instrText>
             </w:r>
             <w:r>
               <w:rPr>
@@ -5187,7 +5309,7 @@
                 <w:noProof/>
                 <w:webHidden/>
               </w:rPr>
-              <w:t>5</w:t>
+              <w:t>6</w:t>
             </w:r>
             <w:r>
               <w:rPr>
@@ -5214,7 +5336,7 @@
               <w14:ligatures w14:val="standardContextual"/>
             </w:rPr>
           </w:pPr>
-          <w:hyperlink w:anchor="_Toc232623071" w:history="1">
+          <w:hyperlink w:anchor="_Toc232682708" w:history="1">
             <w:r>
               <w:rPr>
                 <w:rStyle w:val="Hipervnculo"/>
@@ -5241,7 +5363,7 @@
                 <w:noProof/>
                 <w:webHidden/>
               </w:rPr>
-              <w:instrText xml:space="preserve"> PAGEREF _Toc232623071 \h </w:instrText>
+              <w:instrText xml:space="preserve"> PAGEREF _Toc232682708 \h </w:instrText>
             </w:r>
             <w:r>
               <w:rPr>
@@ -5261,7 +5383,7 @@
                 <w:noProof/>
                 <w:webHidden/>
               </w:rPr>
-              <w:t>6</w:t>
+              <w:t>7</w:t>
             </w:r>
             <w:r>
               <w:rPr>
@@ -5288,7 +5410,7 @@
               <w14:ligatures w14:val="standardContextual"/>
             </w:rPr>
           </w:pPr>
-          <w:hyperlink w:anchor="_Toc232623072" w:history="1">
+          <w:hyperlink w:anchor="_Toc232682709" w:history="1">
             <w:r>
               <w:rPr>
                 <w:rStyle w:val="Hipervnculo"/>
@@ -5315,7 +5437,7 @@
                 <w:noProof/>
                 <w:webHidden/>
               </w:rPr>
-              <w:instrText xml:space="preserve"> PAGEREF _Toc232623072 \h </w:instrText>
+              <w:instrText xml:space="preserve"> PAGEREF _Toc232682709 \h </w:instrText>
             </w:r>
             <w:r>
               <w:rPr>
@@ -5335,7 +5457,7 @@
                 <w:noProof/>
                 <w:webHidden/>
               </w:rPr>
-              <w:t>6</w:t>
+              <w:t>7</w:t>
             </w:r>
             <w:r>
               <w:rPr>
@@ -5362,7 +5484,7 @@
               <w14:ligatures w14:val="standardContextual"/>
             </w:rPr>
           </w:pPr>
-          <w:hyperlink w:anchor="_Toc232623073" w:history="1">
+          <w:hyperlink w:anchor="_Toc232682710" w:history="1">
             <w:r>
               <w:rPr>
                 <w:rStyle w:val="Hipervnculo"/>
@@ -5389,7 +5511,7 @@
                 <w:noProof/>
                 <w:webHidden/>
               </w:rPr>
-              <w:instrText xml:space="preserve"> PAGEREF _Toc232623073 \h </w:instrText>
+              <w:instrText xml:space="preserve"> PAGEREF _Toc232682710 \h </w:instrText>
             </w:r>
             <w:r>
               <w:rPr>
@@ -5409,7 +5531,7 @@
                 <w:noProof/>
                 <w:webHidden/>
               </w:rPr>
-              <w:t>6</w:t>
+              <w:t>7</w:t>
             </w:r>
             <w:r>
               <w:rPr>
@@ -5436,7 +5558,7 @@
               <w14:ligatures w14:val="standardContextual"/>
             </w:rPr>
           </w:pPr>
-          <w:hyperlink w:anchor="_Toc232623074" w:history="1">
+          <w:hyperlink w:anchor="_Toc232682711" w:history="1">
             <w:r>
               <w:rPr>
                 <w:rStyle w:val="Hipervnculo"/>
@@ -5463,7 +5585,7 @@
                 <w:noProof/>
                 <w:webHidden/>
               </w:rPr>
-              <w:instrText xml:space="preserve"> PAGEREF _Toc232623074 \h </w:instrText>
+              <w:instrText xml:space="preserve"> PAGEREF _Toc232682711 \h </w:instrText>
             </w:r>
             <w:r>
               <w:rPr>
@@ -5483,7 +5605,7 @@
                 <w:noProof/>
                 <w:webHidden/>
               </w:rPr>
-              <w:t>6</w:t>
+              <w:t>7</w:t>
             </w:r>
             <w:r>
               <w:rPr>
@@ -5510,7 +5632,7 @@
               <w14:ligatures w14:val="standardContextual"/>
             </w:rPr>
           </w:pPr>
-          <w:hyperlink w:anchor="_Toc232623075" w:history="1">
+          <w:hyperlink w:anchor="_Toc232682712" w:history="1">
             <w:r>
               <w:rPr>
                 <w:rStyle w:val="Hipervnculo"/>
@@ -5537,7 +5659,7 @@
                 <w:noProof/>
                 <w:webHidden/>
               </w:rPr>
-              <w:instrText xml:space="preserve"> PAGEREF _Toc232623075 \h </w:instrText>
+              <w:instrText xml:space="preserve"> PAGEREF _Toc232682712 \h </w:instrText>
             </w:r>
             <w:r>
               <w:rPr>
@@ -5557,7 +5679,7 @@
                 <w:noProof/>
                 <w:webHidden/>
               </w:rPr>
-              <w:t>7</w:t>
+              <w:t>8</w:t>
             </w:r>
             <w:r>
               <w:rPr>
@@ -5584,7 +5706,7 @@
               <w14:ligatures w14:val="standardContextual"/>
             </w:rPr>
           </w:pPr>
-          <w:hyperlink w:anchor="_Toc232623076" w:history="1">
+          <w:hyperlink w:anchor="_Toc232682713" w:history="1">
             <w:r>
               <w:rPr>
                 <w:rStyle w:val="Hipervnculo"/>
@@ -5611,7 +5733,7 @@
                 <w:noProof/>
                 <w:webHidden/>
               </w:rPr>
-              <w:instrText xml:space="preserve"> PAGEREF _Toc232623076 \h </w:instrText>
+              <w:instrText xml:space="preserve"> PAGEREF _Toc232682713 \h </w:instrText>
             </w:r>
             <w:r>
               <w:rPr>
@@ -5631,7 +5753,7 @@
                 <w:noProof/>
                 <w:webHidden/>
               </w:rPr>
-              <w:t>7</w:t>
+              <w:t>8</w:t>
             </w:r>
             <w:r>
               <w:rPr>
@@ -5658,7 +5780,7 @@
               <w14:ligatures w14:val="standardContextual"/>
             </w:rPr>
           </w:pPr>
-          <w:hyperlink w:anchor="_Toc232623077" w:history="1">
+          <w:hyperlink w:anchor="_Toc232682714" w:history="1">
             <w:r>
               <w:rPr>
                 <w:rStyle w:val="Hipervnculo"/>
@@ -5685,7 +5807,7 @@
                 <w:noProof/>
                 <w:webHidden/>
               </w:rPr>
-              <w:instrText xml:space="preserve"> PAGEREF _Toc232623077 \h </w:instrText>
+              <w:instrText xml:space="preserve"> PAGEREF _Toc232682714 \h </w:instrText>
             </w:r>
             <w:r>
               <w:rPr>
@@ -5705,7 +5827,7 @@
                 <w:noProof/>
                 <w:webHidden/>
               </w:rPr>
-              <w:t>8</w:t>
+              <w:t>9</w:t>
             </w:r>
             <w:r>
               <w:rPr>
@@ -5732,7 +5854,7 @@
               <w14:ligatures w14:val="standardContextual"/>
             </w:rPr>
           </w:pPr>
-          <w:hyperlink w:anchor="_Toc232623078" w:history="1">
+          <w:hyperlink w:anchor="_Toc232682715" w:history="1">
             <w:r>
               <w:rPr>
                 <w:rStyle w:val="Hipervnculo"/>
@@ -5759,7 +5881,7 @@
                 <w:noProof/>
                 <w:webHidden/>
               </w:rPr>
-              <w:instrText xml:space="preserve"> PAGEREF _Toc232623078 \h </w:instrText>
+              <w:instrText xml:space="preserve"> PAGEREF _Toc232682715 \h </w:instrText>
             </w:r>
             <w:r>
               <w:rPr>
@@ -5779,7 +5901,7 @@
                 <w:noProof/>
                 <w:webHidden/>
               </w:rPr>
-              <w:t>8</w:t>
+              <w:t>9</w:t>
             </w:r>
             <w:r>
               <w:rPr>
@@ -5806,7 +5928,7 @@
               <w14:ligatures w14:val="standardContextual"/>
             </w:rPr>
           </w:pPr>
-          <w:hyperlink w:anchor="_Toc232623079" w:history="1">
+          <w:hyperlink w:anchor="_Toc232682716" w:history="1">
             <w:r>
               <w:rPr>
                 <w:rStyle w:val="Hipervnculo"/>
@@ -5833,7 +5955,7 @@
                 <w:noProof/>
                 <w:webHidden/>
               </w:rPr>
-              <w:instrText xml:space="preserve"> PAGEREF _Toc232623079 \h </w:instrText>
+              <w:instrText xml:space="preserve"> PAGEREF _Toc232682716 \h </w:instrText>
             </w:r>
             <w:r>
               <w:rPr>
@@ -5853,7 +5975,7 @@
                 <w:noProof/>
                 <w:webHidden/>
               </w:rPr>
-              <w:t>8</w:t>
+              <w:t>9</w:t>
             </w:r>
             <w:r>
               <w:rPr>
@@ -5880,7 +6002,7 @@
               <w14:ligatures w14:val="standardContextual"/>
             </w:rPr>
           </w:pPr>
-          <w:hyperlink w:anchor="_Toc232623080" w:history="1">
+          <w:hyperlink w:anchor="_Toc232682717" w:history="1">
             <w:r>
               <w:rPr>
                 <w:rStyle w:val="Hipervnculo"/>
@@ -5907,7 +6029,7 @@
                 <w:noProof/>
                 <w:webHidden/>
               </w:rPr>
-              <w:instrText xml:space="preserve"> PAGEREF _Toc232623080 \h </w:instrText>
+              <w:instrText xml:space="preserve"> PAGEREF _Toc232682717 \h </w:instrText>
             </w:r>
             <w:r>
               <w:rPr>
@@ -5927,7 +6049,7 @@
                 <w:noProof/>
                 <w:webHidden/>
               </w:rPr>
-              <w:t>11</w:t>
+              <w:t>12</w:t>
             </w:r>
             <w:r>
               <w:rPr>
@@ -5954,7 +6076,7 @@
               <w14:ligatures w14:val="standardContextual"/>
             </w:rPr>
           </w:pPr>
-          <w:hyperlink w:anchor="_Toc232623081" w:history="1">
+          <w:hyperlink w:anchor="_Toc232682718" w:history="1">
             <w:r>
               <w:rPr>
                 <w:rStyle w:val="Hipervnculo"/>
@@ -5981,7 +6103,7 @@
                 <w:noProof/>
                 <w:webHidden/>
               </w:rPr>
-              <w:instrText xml:space="preserve"> PAGEREF _Toc232623081 \h </w:instrText>
+              <w:instrText xml:space="preserve"> PAGEREF _Toc232682718 \h </w:instrText>
             </w:r>
             <w:r>
               <w:rPr>
@@ -6001,7 +6123,7 @@
                 <w:noProof/>
                 <w:webHidden/>
               </w:rPr>
-              <w:t>11</w:t>
+              <w:t>12</w:t>
             </w:r>
             <w:r>
               <w:rPr>
@@ -6028,7 +6150,7 @@
               <w14:ligatures w14:val="standardContextual"/>
             </w:rPr>
           </w:pPr>
-          <w:hyperlink w:anchor="_Toc232623082" w:history="1">
+          <w:hyperlink w:anchor="_Toc232682719" w:history="1">
             <w:r>
               <w:rPr>
                 <w:rStyle w:val="Hipervnculo"/>
@@ -6055,7 +6177,7 @@
                 <w:noProof/>
                 <w:webHidden/>
               </w:rPr>
-              <w:instrText xml:space="preserve"> PAGEREF _Toc232623082 \h </w:instrText>
+              <w:instrText xml:space="preserve"> PAGEREF _Toc232682719 \h </w:instrText>
             </w:r>
             <w:r>
               <w:rPr>
@@ -6075,7 +6197,7 @@
                 <w:noProof/>
                 <w:webHidden/>
               </w:rPr>
-              <w:t>11</w:t>
+              <w:t>12</w:t>
             </w:r>
             <w:r>
               <w:rPr>
@@ -6102,7 +6224,7 @@
               <w14:ligatures w14:val="standardContextual"/>
             </w:rPr>
           </w:pPr>
-          <w:hyperlink w:anchor="_Toc232623083" w:history="1">
+          <w:hyperlink w:anchor="_Toc232682720" w:history="1">
             <w:r>
               <w:rPr>
                 <w:rStyle w:val="Hipervnculo"/>
@@ -6129,7 +6251,7 @@
                 <w:noProof/>
                 <w:webHidden/>
               </w:rPr>
-              <w:instrText xml:space="preserve"> PAGEREF _Toc232623083 \h </w:instrText>
+              <w:instrText xml:space="preserve"> PAGEREF _Toc232682720 \h </w:instrText>
             </w:r>
             <w:r>
               <w:rPr>
@@ -6149,7 +6271,7 @@
                 <w:noProof/>
                 <w:webHidden/>
               </w:rPr>
-              <w:t>12</w:t>
+              <w:t>13</w:t>
             </w:r>
             <w:r>
               <w:rPr>
@@ -6176,7 +6298,7 @@
               <w14:ligatures w14:val="standardContextual"/>
             </w:rPr>
           </w:pPr>
-          <w:hyperlink w:anchor="_Toc232623084" w:history="1">
+          <w:hyperlink w:anchor="_Toc232682721" w:history="1">
             <w:r>
               <w:rPr>
                 <w:rStyle w:val="Hipervnculo"/>
@@ -6203,7 +6325,7 @@
                 <w:noProof/>
                 <w:webHidden/>
               </w:rPr>
-              <w:instrText xml:space="preserve"> PAGEREF _Toc232623084 \h </w:instrText>
+              <w:instrText xml:space="preserve"> PAGEREF _Toc232682721 \h </w:instrText>
             </w:r>
             <w:r>
               <w:rPr>
@@ -6223,7 +6345,7 @@
                 <w:noProof/>
                 <w:webHidden/>
               </w:rPr>
-              <w:t>12</w:t>
+              <w:t>13</w:t>
             </w:r>
             <w:r>
               <w:rPr>
@@ -6250,7 +6372,7 @@
               <w14:ligatures w14:val="standardContextual"/>
             </w:rPr>
           </w:pPr>
-          <w:hyperlink w:anchor="_Toc232623085" w:history="1">
+          <w:hyperlink w:anchor="_Toc232682722" w:history="1">
             <w:r>
               <w:rPr>
                 <w:rStyle w:val="Hipervnculo"/>
@@ -6277,7 +6399,7 @@
                 <w:noProof/>
                 <w:webHidden/>
               </w:rPr>
-              <w:instrText xml:space="preserve"> PAGEREF _Toc232623085 \h </w:instrText>
+              <w:instrText xml:space="preserve"> PAGEREF _Toc232682722 \h </w:instrText>
             </w:r>
             <w:r>
               <w:rPr>
@@ -6297,7 +6419,7 @@
                 <w:noProof/>
                 <w:webHidden/>
               </w:rPr>
-              <w:t>13</w:t>
+              <w:t>14</w:t>
             </w:r>
             <w:r>
               <w:rPr>
@@ -6324,7 +6446,7 @@
               <w14:ligatures w14:val="standardContextual"/>
             </w:rPr>
           </w:pPr>
-          <w:hyperlink w:anchor="_Toc232623086" w:history="1">
+          <w:hyperlink w:anchor="_Toc232682723" w:history="1">
             <w:r>
               <w:rPr>
                 <w:rStyle w:val="Hipervnculo"/>
@@ -6351,7 +6473,7 @@
                 <w:noProof/>
                 <w:webHidden/>
               </w:rPr>
-              <w:instrText xml:space="preserve"> PAGEREF _Toc232623086 \h </w:instrText>
+              <w:instrText xml:space="preserve"> PAGEREF _Toc232682723 \h </w:instrText>
             </w:r>
             <w:r>
               <w:rPr>
@@ -6371,7 +6493,7 @@
                 <w:noProof/>
                 <w:webHidden/>
               </w:rPr>
-              <w:t>13</w:t>
+              <w:t>14</w:t>
             </w:r>
             <w:r>
               <w:rPr>
@@ -6398,7 +6520,7 @@
               <w14:ligatures w14:val="standardContextual"/>
             </w:rPr>
           </w:pPr>
-          <w:hyperlink w:anchor="_Toc232623087" w:history="1">
+          <w:hyperlink w:anchor="_Toc232682724" w:history="1">
             <w:r>
               <w:rPr>
                 <w:rStyle w:val="Hipervnculo"/>
@@ -6425,7 +6547,7 @@
                 <w:noProof/>
                 <w:webHidden/>
               </w:rPr>
-              <w:instrText xml:space="preserve"> PAGEREF _Toc232623087 \h </w:instrText>
+              <w:instrText xml:space="preserve"> PAGEREF _Toc232682724 \h </w:instrText>
             </w:r>
             <w:r>
               <w:rPr>
@@ -6445,7 +6567,7 @@
                 <w:noProof/>
                 <w:webHidden/>
               </w:rPr>
-              <w:t>15</w:t>
+              <w:t>16</w:t>
             </w:r>
             <w:r>
               <w:rPr>
@@ -6472,7 +6594,7 @@
               <w14:ligatures w14:val="standardContextual"/>
             </w:rPr>
           </w:pPr>
-          <w:hyperlink w:anchor="_Toc232623088" w:history="1">
+          <w:hyperlink w:anchor="_Toc232682725" w:history="1">
             <w:r>
               <w:rPr>
                 <w:rStyle w:val="Hipervnculo"/>
@@ -6499,7 +6621,7 @@
                 <w:noProof/>
                 <w:webHidden/>
               </w:rPr>
-              <w:instrText xml:space="preserve"> PAGEREF _Toc232623088 \h </w:instrText>
+              <w:instrText xml:space="preserve"> PAGEREF _Toc232682725 \h </w:instrText>
             </w:r>
             <w:r>
               <w:rPr>
@@ -6519,7 +6641,7 @@
                 <w:noProof/>
                 <w:webHidden/>
               </w:rPr>
-              <w:t>15</w:t>
+              <w:t>16</w:t>
             </w:r>
             <w:r>
               <w:rPr>
@@ -6546,7 +6668,7 @@
               <w14:ligatures w14:val="standardContextual"/>
             </w:rPr>
           </w:pPr>
-          <w:hyperlink w:anchor="_Toc232623089" w:history="1">
+          <w:hyperlink w:anchor="_Toc232682726" w:history="1">
             <w:r>
               <w:rPr>
                 <w:rStyle w:val="Hipervnculo"/>
@@ -6573,7 +6695,7 @@
                 <w:noProof/>
                 <w:webHidden/>
               </w:rPr>
-              <w:instrText xml:space="preserve"> PAGEREF _Toc232623089 \h </w:instrText>
+              <w:instrText xml:space="preserve"> PAGEREF _Toc232682726 \h </w:instrText>
             </w:r>
             <w:r>
               <w:rPr>
@@ -6593,7 +6715,7 @@
                 <w:noProof/>
                 <w:webHidden/>
               </w:rPr>
-              <w:t>16</w:t>
+              <w:t>17</w:t>
             </w:r>
             <w:r>
               <w:rPr>
@@ -6620,7 +6742,7 @@
               <w14:ligatures w14:val="standardContextual"/>
             </w:rPr>
           </w:pPr>
-          <w:hyperlink w:anchor="_Toc232623090" w:history="1">
+          <w:hyperlink w:anchor="_Toc232682727" w:history="1">
             <w:r>
               <w:rPr>
                 <w:rStyle w:val="Hipervnculo"/>
@@ -6647,7 +6769,7 @@
                 <w:noProof/>
                 <w:webHidden/>
               </w:rPr>
-              <w:instrText xml:space="preserve"> PAGEREF _Toc232623090 \h </w:instrText>
+              <w:instrText xml:space="preserve"> PAGEREF _Toc232682727 \h </w:instrText>
             </w:r>
             <w:r>
               <w:rPr>
@@ -6667,7 +6789,7 @@
                 <w:noProof/>
                 <w:webHidden/>
               </w:rPr>
-              <w:t>16</w:t>
+              <w:t>17</w:t>
             </w:r>
             <w:r>
               <w:rPr>
@@ -6694,7 +6816,7 @@
               <w14:ligatures w14:val="standardContextual"/>
             </w:rPr>
           </w:pPr>
-          <w:hyperlink w:anchor="_Toc232623091" w:history="1">
+          <w:hyperlink w:anchor="_Toc232682728" w:history="1">
             <w:r>
               <w:rPr>
                 <w:rStyle w:val="Hipervnculo"/>
@@ -6721,7 +6843,7 @@
                 <w:noProof/>
                 <w:webHidden/>
               </w:rPr>
-              <w:instrText xml:space="preserve"> PAGEREF _Toc232623091 \h </w:instrText>
+              <w:instrText xml:space="preserve"> PAGEREF _Toc232682728 \h </w:instrText>
             </w:r>
             <w:r>
               <w:rPr>
@@ -6741,7 +6863,7 @@
                 <w:noProof/>
                 <w:webHidden/>
               </w:rPr>
-              <w:t>16</w:t>
+              <w:t>17</w:t>
             </w:r>
             <w:r>
               <w:rPr>
@@ -6768,7 +6890,7 @@
               <w14:ligatures w14:val="standardContextual"/>
             </w:rPr>
           </w:pPr>
-          <w:hyperlink w:anchor="_Toc232623092" w:history="1">
+          <w:hyperlink w:anchor="_Toc232682729" w:history="1">
             <w:r>
               <w:rPr>
                 <w:rStyle w:val="Hipervnculo"/>
@@ -6795,7 +6917,7 @@
                 <w:noProof/>
                 <w:webHidden/>
               </w:rPr>
-              <w:instrText xml:space="preserve"> PAGEREF _Toc232623092 \h </w:instrText>
+              <w:instrText xml:space="preserve"> PAGEREF _Toc232682729 \h </w:instrText>
             </w:r>
             <w:r>
               <w:rPr>
@@ -6815,7 +6937,7 @@
                 <w:noProof/>
                 <w:webHidden/>
               </w:rPr>
-              <w:t>16</w:t>
+              <w:t>17</w:t>
             </w:r>
             <w:r>
               <w:rPr>
@@ -6842,7 +6964,7 @@
               <w14:ligatures w14:val="standardContextual"/>
             </w:rPr>
           </w:pPr>
-          <w:hyperlink w:anchor="_Toc232623093" w:history="1">
+          <w:hyperlink w:anchor="_Toc232682730" w:history="1">
             <w:r>
               <w:rPr>
                 <w:rStyle w:val="Hipervnculo"/>
@@ -6869,7 +6991,7 @@
                 <w:noProof/>
                 <w:webHidden/>
               </w:rPr>
-              <w:instrText xml:space="preserve"> PAGEREF _Toc232623093 \h </w:instrText>
+              <w:instrText xml:space="preserve"> PAGEREF _Toc232682730 \h </w:instrText>
             </w:r>
             <w:r>
               <w:rPr>
@@ -6889,7 +7011,7 @@
                 <w:noProof/>
                 <w:webHidden/>
               </w:rPr>
-              <w:t>17</w:t>
+              <w:t>18</w:t>
             </w:r>
             <w:r>
               <w:rPr>
@@ -6916,7 +7038,7 @@
               <w14:ligatures w14:val="standardContextual"/>
             </w:rPr>
           </w:pPr>
-          <w:hyperlink w:anchor="_Toc232623094" w:history="1">
+          <w:hyperlink w:anchor="_Toc232682731" w:history="1">
             <w:r>
               <w:rPr>
                 <w:rStyle w:val="Hipervnculo"/>
@@ -6943,7 +7065,7 @@
                 <w:noProof/>
                 <w:webHidden/>
               </w:rPr>
-              <w:instrText xml:space="preserve"> PAGEREF _Toc232623094 \h </w:instrText>
+              <w:instrText xml:space="preserve"> PAGEREF _Toc232682731 \h </w:instrText>
             </w:r>
             <w:r>
               <w:rPr>
@@ -6963,7 +7085,7 @@
                 <w:noProof/>
                 <w:webHidden/>
               </w:rPr>
-              <w:t>17</w:t>
+              <w:t>18</w:t>
             </w:r>
             <w:r>
               <w:rPr>
@@ -6990,7 +7112,7 @@
               <w14:ligatures w14:val="standardContextual"/>
             </w:rPr>
           </w:pPr>
-          <w:hyperlink w:anchor="_Toc232623095" w:history="1">
+          <w:hyperlink w:anchor="_Toc232682732" w:history="1">
             <w:r>
               <w:rPr>
                 <w:rStyle w:val="Hipervnculo"/>
@@ -7017,7 +7139,7 @@
                 <w:noProof/>
                 <w:webHidden/>
               </w:rPr>
-              <w:instrText xml:space="preserve"> PAGEREF _Toc232623095 \h </w:instrText>
+              <w:instrText xml:space="preserve"> PAGEREF _Toc232682732 \h </w:instrText>
             </w:r>
             <w:r>
               <w:rPr>
@@ -7037,7 +7159,7 @@
                 <w:noProof/>
                 <w:webHidden/>
               </w:rPr>
-              <w:t>18</w:t>
+              <w:t>19</w:t>
             </w:r>
             <w:r>
               <w:rPr>
@@ -7062,11 +7184,35 @@
               <w:sz w:val="24"/>
               <w:szCs w:val="24"/>
             </w:rPr>
+            <w:lastRenderedPageBreak/>
             <w:fldChar w:fldCharType="end"/>
           </w:r>
         </w:p>
       </w:sdtContent>
     </w:sdt>
+    <w:p>
+      <w:pPr>
+        <w:pStyle w:val="Ttulo2"/>
+        <w:jc w:val="center"/>
+      </w:pPr>
+      <w:bookmarkStart w:id="0" w:name="_Toc232682697"/>
+      <w:r>
+        <w:t>H</w:t>
+      </w:r>
+      <w:r>
+        <w:t xml:space="preserve">oja </w:t>
+      </w:r>
+      <w:r>
+        <w:t xml:space="preserve">reservada </w:t>
+      </w:r>
+      <w:r>
+        <w:t>para la corrección del tutor académico</w:t>
+      </w:r>
+      <w:bookmarkEnd w:id="0"/>
+      <w:r>
+        <w:br w:type="page"/>
+      </w:r>
+    </w:p>
     <w:p>
       <w:pPr>
         <w:pStyle w:val="Ttulo1"/>
@@ -7079,7 +7225,7 @@
           <w:color w:val="auto"/>
         </w:rPr>
       </w:pPr>
-      <w:bookmarkStart w:id="0" w:name="_Toc232623061"/>
+      <w:bookmarkStart w:id="1" w:name="_Toc232682698"/>
       <w:r>
         <w:rPr>
           <w:rFonts w:cs="Times New Roman"/>
@@ -7088,7 +7234,27 @@
           <w:color w:val="auto"/>
         </w:rPr>
         <w:lastRenderedPageBreak/>
-        <w:t>Desarrollo Frontend para Sistema de Subtitulado en Tiempo Real</w:t>
+        <w:t xml:space="preserve">Desarrollo </w:t>
+      </w:r>
+      <w:proofErr w:type="spellStart"/>
+      <w:r>
+        <w:rPr>
+          <w:rFonts w:cs="Times New Roman"/>
+          <w:b/>
+          <w:bCs/>
+          <w:color w:val="auto"/>
+        </w:rPr>
+        <w:t>Frontend</w:t>
+      </w:r>
+      <w:proofErr w:type="spellEnd"/>
+      <w:r>
+        <w:rPr>
+          <w:rFonts w:cs="Times New Roman"/>
+          <w:b/>
+          <w:bCs/>
+          <w:color w:val="auto"/>
+        </w:rPr>
+        <w:t xml:space="preserve"> para Sistema de Subtitulado en Tiempo Real</w:t>
       </w:r>
       <w:r>
         <w:rPr>
@@ -7099,18 +7265,18 @@
         </w:rPr>
         <w:t xml:space="preserve"> Inclu-IA</w:t>
       </w:r>
-      <w:bookmarkEnd w:id="0"/>
+      <w:bookmarkEnd w:id="1"/>
     </w:p>
     <w:p/>
     <w:p>
       <w:pPr>
         <w:pStyle w:val="Ttulo2"/>
       </w:pPr>
-      <w:bookmarkStart w:id="1" w:name="_Toc232623062"/>
+      <w:bookmarkStart w:id="2" w:name="_Toc232682699"/>
       <w:r>
         <w:t>Introducción</w:t>
       </w:r>
-      <w:bookmarkEnd w:id="1"/>
+      <w:bookmarkEnd w:id="2"/>
     </w:p>
     <w:p/>
     <w:p>
@@ -7166,7 +7332,7 @@
       <w:pPr>
         <w:pStyle w:val="Ttulo2"/>
       </w:pPr>
-      <w:bookmarkStart w:id="2" w:name="_Toc232623063"/>
+      <w:bookmarkStart w:id="3" w:name="_Toc232682700"/>
       <w:r>
         <w:lastRenderedPageBreak/>
         <w:t>Análisis</w:t>
@@ -7174,18 +7340,18 @@
       <w:r>
         <w:t xml:space="preserve"> de relevamientos y oportunidades de mejora</w:t>
       </w:r>
-      <w:bookmarkEnd w:id="2"/>
+      <w:bookmarkEnd w:id="3"/>
     </w:p>
     <w:p/>
     <w:p>
       <w:pPr>
         <w:pStyle w:val="Ttulo3"/>
       </w:pPr>
-      <w:bookmarkStart w:id="3" w:name="_Toc232623064"/>
+      <w:bookmarkStart w:id="4" w:name="_Toc232682701"/>
       <w:r>
         <w:t>Relevamiento de la interfaz existente</w:t>
       </w:r>
-      <w:bookmarkEnd w:id="3"/>
+      <w:bookmarkEnd w:id="4"/>
     </w:p>
     <w:p/>
     <w:p>
@@ -7205,7 +7371,15 @@
     </w:p>
     <w:p>
       <w:r>
-        <w:t>Con el fin de obtener una visión más completa del comportamiento de la aplicación, se realizaron pruebas de utilización desde distintos dispositivos y entornos de ejecución, contemplando teléfonos móviles, tablets y computadoras. Asimismo, se analizaron distintos escenarios de uso habituales, considerando tanto sesiones breves como períodos prolongados de utilización.</w:t>
+        <w:t xml:space="preserve">Con el fin de obtener una visión más completa del comportamiento de la aplicación, se realizaron pruebas de utilización desde distintos dispositivos y entornos de ejecución, contemplando teléfonos móviles, </w:t>
+      </w:r>
+      <w:proofErr w:type="spellStart"/>
+      <w:r>
+        <w:t>tablets</w:t>
+      </w:r>
+      <w:proofErr w:type="spellEnd"/>
+      <w:r>
+        <w:t xml:space="preserve"> y computadoras. Asimismo, se analizaron distintos escenarios de uso habituales, considerando tanto sesiones breves como períodos prolongados de utilización.</w:t>
       </w:r>
     </w:p>
     <w:p>
@@ -7218,11 +7392,11 @@
       <w:pPr>
         <w:pStyle w:val="Ttulo3"/>
       </w:pPr>
-      <w:bookmarkStart w:id="4" w:name="_Toc232623065"/>
+      <w:bookmarkStart w:id="5" w:name="_Toc232682702"/>
       <w:r>
         <w:t>Identificación de requerimientos</w:t>
       </w:r>
-      <w:bookmarkEnd w:id="4"/>
+      <w:bookmarkEnd w:id="5"/>
     </w:p>
     <w:p/>
     <w:p>
@@ -7251,7 +7425,15 @@
     </w:p>
     <w:p>
       <w:r>
-        <w:t>Por otra parte, se identificó la necesidad de garantizar una experiencia consistente en diferentes plataformas. La aplicación estaba destinada a ser utilizada desde teléfonos móviles, tablets y computadoras con distintos sistemas operativos y navegadores, por lo que resultaba importante evaluar su comportamiento en escenarios de uso heterogéneos y contemplar posibles diferencias entre plataformas.</w:t>
+        <w:t xml:space="preserve">Por otra parte, se identificó la necesidad de garantizar una experiencia consistente en diferentes plataformas. La aplicación estaba destinada a ser utilizada desde teléfonos móviles, </w:t>
+      </w:r>
+      <w:proofErr w:type="spellStart"/>
+      <w:r>
+        <w:t>tablets</w:t>
+      </w:r>
+      <w:proofErr w:type="spellEnd"/>
+      <w:r>
+        <w:t xml:space="preserve"> y computadoras con distintos sistemas operativos y navegadores, por lo que resultaba importante evaluar su comportamiento en escenarios de uso heterogéneos y contemplar posibles diferencias entre plataformas.</w:t>
       </w:r>
     </w:p>
     <w:p>
@@ -7274,11 +7456,11 @@
       <w:pPr>
         <w:pStyle w:val="Ttulo3"/>
       </w:pPr>
-      <w:bookmarkStart w:id="5" w:name="_Toc232623066"/>
+      <w:bookmarkStart w:id="6" w:name="_Toc232682703"/>
       <w:r>
         <w:t>Síntesis del análisis realizado</w:t>
       </w:r>
-      <w:bookmarkEnd w:id="5"/>
+      <w:bookmarkEnd w:id="6"/>
     </w:p>
     <w:p/>
     <w:p>
@@ -7323,7 +7505,7 @@
           <w:rStyle w:val="Ttulo3Car"/>
         </w:rPr>
       </w:pPr>
-      <w:bookmarkStart w:id="6" w:name="_Toc232623067"/>
+      <w:bookmarkStart w:id="7" w:name="_Toc232682704"/>
       <w:r>
         <w:rPr>
           <w:rStyle w:val="Ttulo2Car"/>
@@ -7331,7 +7513,7 @@
         <w:lastRenderedPageBreak/>
         <w:t>Objetivos de Desarrollo</w:t>
       </w:r>
-      <w:bookmarkEnd w:id="6"/>
+      <w:bookmarkEnd w:id="7"/>
     </w:p>
     <w:p>
       <w:pPr>
@@ -7358,11 +7540,11 @@
       <w:pPr>
         <w:pStyle w:val="Ttulo3"/>
       </w:pPr>
-      <w:bookmarkStart w:id="7" w:name="_Toc232623068"/>
+      <w:bookmarkStart w:id="8" w:name="_Toc232682705"/>
       <w:r>
         <w:t>Mejorar la accesibilidad</w:t>
       </w:r>
-      <w:bookmarkEnd w:id="7"/>
+      <w:bookmarkEnd w:id="8"/>
     </w:p>
     <w:p/>
     <w:p>
@@ -7380,11 +7562,11 @@
       <w:pPr>
         <w:pStyle w:val="Ttulo3"/>
       </w:pPr>
-      <w:bookmarkStart w:id="8" w:name="_Toc232623069"/>
+      <w:bookmarkStart w:id="9" w:name="_Toc232682706"/>
       <w:r>
         <w:t>Optimizar la experiencia de usuario</w:t>
       </w:r>
-      <w:bookmarkEnd w:id="8"/>
+      <w:bookmarkEnd w:id="9"/>
     </w:p>
     <w:p/>
     <w:p>
@@ -7402,11 +7584,11 @@
       <w:pPr>
         <w:pStyle w:val="Ttulo3"/>
       </w:pPr>
-      <w:bookmarkStart w:id="9" w:name="_Toc232623070"/>
+      <w:bookmarkStart w:id="10" w:name="_Toc232682707"/>
       <w:r>
         <w:t>Incrementar la compatibilidad multiplataforma</w:t>
       </w:r>
-      <w:bookmarkEnd w:id="9"/>
+      <w:bookmarkEnd w:id="10"/>
     </w:p>
     <w:p/>
     <w:p>
@@ -7424,12 +7606,12 @@
       <w:pPr>
         <w:pStyle w:val="Ttulo3"/>
       </w:pPr>
-      <w:bookmarkStart w:id="10" w:name="_Toc232623071"/>
+      <w:bookmarkStart w:id="11" w:name="_Toc232682708"/>
       <w:r>
         <w:lastRenderedPageBreak/>
         <w:t>Facilitar el acceso y la disponibilidad del sistema</w:t>
       </w:r>
-      <w:bookmarkEnd w:id="10"/>
+      <w:bookmarkEnd w:id="11"/>
     </w:p>
     <w:p/>
     <w:p>
@@ -7447,11 +7629,11 @@
       <w:pPr>
         <w:pStyle w:val="Ttulo3"/>
       </w:pPr>
-      <w:bookmarkStart w:id="11" w:name="_Toc232623072"/>
+      <w:bookmarkStart w:id="12" w:name="_Toc232682709"/>
       <w:r>
         <w:t>Consolidar la estabilidad y calidad de la interfaz</w:t>
       </w:r>
-      <w:bookmarkEnd w:id="11"/>
+      <w:bookmarkEnd w:id="12"/>
     </w:p>
     <w:p/>
     <w:p>
@@ -7483,11 +7665,11 @@
       <w:pPr>
         <w:pStyle w:val="Ttulo2"/>
       </w:pPr>
-      <w:bookmarkStart w:id="12" w:name="_Toc232623073"/>
+      <w:bookmarkStart w:id="13" w:name="_Toc232682710"/>
       <w:r>
         <w:t>Arquitectura del Frontend</w:t>
       </w:r>
-      <w:bookmarkEnd w:id="12"/>
+      <w:bookmarkEnd w:id="13"/>
     </w:p>
     <w:p/>
     <w:p>
@@ -7505,11 +7687,11 @@
       <w:pPr>
         <w:pStyle w:val="Ttulo3"/>
       </w:pPr>
-      <w:bookmarkStart w:id="13" w:name="_Toc232623074"/>
+      <w:bookmarkStart w:id="14" w:name="_Toc232682711"/>
       <w:r>
         <w:t>Tecnologías utilizadas</w:t>
       </w:r>
-      <w:bookmarkEnd w:id="13"/>
+      <w:bookmarkEnd w:id="14"/>
     </w:p>
     <w:p/>
     <w:p>
@@ -7538,11 +7720,11 @@
       <w:pPr>
         <w:pStyle w:val="Ttulo3"/>
       </w:pPr>
-      <w:bookmarkStart w:id="14" w:name="_Toc232623075"/>
+      <w:bookmarkStart w:id="15" w:name="_Toc232682712"/>
       <w:r>
         <w:t>Estructura del proyecto</w:t>
       </w:r>
-      <w:bookmarkEnd w:id="14"/>
+      <w:bookmarkEnd w:id="15"/>
     </w:p>
     <w:p/>
     <w:p>
@@ -7560,6 +7742,9 @@
         <w:jc w:val="center"/>
       </w:pPr>
       <w:r>
+        <w:rPr>
+          <w:noProof/>
+        </w:rPr>
         <w:drawing>
           <wp:inline distT="0" distB="0" distL="0" distR="0" wp14:anchorId="1A117D73" wp14:editId="1D4D1ABE">
             <wp:extent cx="1744980" cy="2380079"/>
@@ -7611,7 +7796,17 @@
     </w:p>
     <w:p>
       <w:r>
-        <w:t>Por otra parte, los archivos *manifest.json* y *serviceWorker.js* proporcionan las funcionalidades necesarias para el funcionamiento de la aplicación como Progressive Web App, permitiendo su instalación y optimizando la gestión de recursos dentro del navegador.</w:t>
+        <w:t>Por otra parte, los archivos *</w:t>
+      </w:r>
+      <w:proofErr w:type="spellStart"/>
+      <w:proofErr w:type="gramStart"/>
+      <w:r>
+        <w:t>manifest.json</w:t>
+      </w:r>
+      <w:proofErr w:type="spellEnd"/>
+      <w:proofErr w:type="gramEnd"/>
+      <w:r>
+        <w:t>* y *serviceWorker.js* proporcionan las funcionalidades necesarias para el funcionamiento de la aplicación como Progressive Web App, permitiendo su instalación y optimizando la gestión de recursos dentro del navegador.</w:t>
       </w:r>
     </w:p>
     <w:p/>
@@ -7619,11 +7814,11 @@
       <w:pPr>
         <w:pStyle w:val="Ttulo3"/>
       </w:pPr>
-      <w:bookmarkStart w:id="15" w:name="_Toc232623076"/>
+      <w:bookmarkStart w:id="16" w:name="_Toc232682713"/>
       <w:r>
         <w:t>Comunicación con el backend</w:t>
       </w:r>
-      <w:bookmarkEnd w:id="15"/>
+      <w:bookmarkEnd w:id="16"/>
     </w:p>
     <w:p/>
     <w:p>
@@ -7651,6 +7846,9 @@
         <w:jc w:val="center"/>
       </w:pPr>
       <w:r>
+        <w:rPr>
+          <w:noProof/>
+        </w:rPr>
         <w:lastRenderedPageBreak/>
         <w:drawing>
           <wp:inline distT="0" distB="0" distL="0" distR="0" wp14:anchorId="3D84E138" wp14:editId="136D25AC">
@@ -7706,11 +7904,11 @@
       <w:pPr>
         <w:pStyle w:val="Ttulo2"/>
       </w:pPr>
-      <w:bookmarkStart w:id="16" w:name="_Toc232623077"/>
+      <w:bookmarkStart w:id="17" w:name="_Toc232682714"/>
       <w:r>
         <w:t>Mejoras Implementadas</w:t>
       </w:r>
-      <w:bookmarkEnd w:id="16"/>
+      <w:bookmarkEnd w:id="17"/>
     </w:p>
     <w:p/>
     <w:p>
@@ -7723,11 +7921,11 @@
       <w:pPr>
         <w:pStyle w:val="Ttulo3"/>
       </w:pPr>
-      <w:bookmarkStart w:id="17" w:name="_Toc232623078"/>
+      <w:bookmarkStart w:id="18" w:name="_Toc232682715"/>
       <w:r>
         <w:t>Reorganización de la Interfaz</w:t>
       </w:r>
-      <w:bookmarkEnd w:id="17"/>
+      <w:bookmarkEnd w:id="18"/>
     </w:p>
     <w:p/>
     <w:p>
@@ -7750,11 +7948,11 @@
       <w:pPr>
         <w:pStyle w:val="Ttulo3"/>
       </w:pPr>
-      <w:bookmarkStart w:id="18" w:name="_Toc232623079"/>
+      <w:bookmarkStart w:id="19" w:name="_Toc232682716"/>
       <w:r>
         <w:t>Mejoras de Accesibilidad</w:t>
       </w:r>
-      <w:bookmarkEnd w:id="18"/>
+      <w:bookmarkEnd w:id="19"/>
     </w:p>
     <w:p/>
     <w:p>
@@ -7773,6 +7971,9 @@
         <w:jc w:val="center"/>
       </w:pPr>
       <w:r>
+        <w:rPr>
+          <w:noProof/>
+        </w:rPr>
         <w:drawing>
           <wp:inline distT="0" distB="0" distL="0" distR="0" wp14:anchorId="1A9C7947" wp14:editId="618F4F98">
             <wp:extent cx="3314987" cy="1348857"/>
@@ -7834,6 +8035,9 @@
         <w:jc w:val="center"/>
       </w:pPr>
       <w:r>
+        <w:rPr>
+          <w:noProof/>
+        </w:rPr>
         <w:drawing>
           <wp:inline distT="0" distB="0" distL="0" distR="0" wp14:anchorId="4582104A" wp14:editId="5A0DE176">
             <wp:extent cx="4334400" cy="2880000"/>
@@ -7886,37 +8090,30 @@
       <w:r>
         <w:t xml:space="preserve">Ilustración </w:t>
       </w:r>
-      <w:r>
-        <w:fldChar w:fldCharType="begin"/>
-      </w:r>
-      <w:r>
-        <w:instrText xml:space="preserve"> SEQ Ilustración \* ARABIC </w:instrText>
-      </w:r>
-      <w:r>
-        <w:fldChar w:fldCharType="separate"/>
-      </w:r>
+      <w:fldSimple w:instr=" SEQ Ilustración \* ARABIC ">
+        <w:r>
+          <w:rPr>
+            <w:noProof/>
+          </w:rPr>
+          <w:t>1</w:t>
+        </w:r>
+      </w:fldSimple>
+      <w:r>
+        <w:t xml:space="preserve"> - </w:t>
+      </w:r>
+      <w:r>
+        <w:t>Modo contraste “Light”</w:t>
+      </w:r>
+    </w:p>
+    <w:p>
+      <w:pPr>
+        <w:keepNext/>
+        <w:jc w:val="center"/>
+      </w:pPr>
       <w:r>
         <w:rPr>
           <w:noProof/>
         </w:rPr>
-        <w:t>1</w:t>
-      </w:r>
-      <w:r>
-        <w:fldChar w:fldCharType="end"/>
-      </w:r>
-      <w:r>
-        <w:t xml:space="preserve"> - </w:t>
-      </w:r>
-      <w:r>
-        <w:t>Modo contraste “Light”</w:t>
-      </w:r>
-    </w:p>
-    <w:p>
-      <w:pPr>
-        <w:keepNext/>
-        <w:jc w:val="center"/>
-      </w:pPr>
-      <w:r>
         <w:lastRenderedPageBreak/>
         <w:drawing>
           <wp:inline distT="0" distB="0" distL="0" distR="0" wp14:anchorId="3F4E6B2E" wp14:editId="61EADA73">
@@ -7970,37 +8167,30 @@
       <w:r>
         <w:t xml:space="preserve">Ilustración </w:t>
       </w:r>
-      <w:r>
-        <w:fldChar w:fldCharType="begin"/>
-      </w:r>
-      <w:r>
-        <w:instrText xml:space="preserve"> SEQ Ilustración \* ARABIC </w:instrText>
-      </w:r>
-      <w:r>
-        <w:fldChar w:fldCharType="separate"/>
-      </w:r>
+      <w:fldSimple w:instr=" SEQ Ilustración \* ARABIC ">
+        <w:r>
+          <w:rPr>
+            <w:noProof/>
+          </w:rPr>
+          <w:t>2</w:t>
+        </w:r>
+      </w:fldSimple>
+      <w:r>
+        <w:t xml:space="preserve"> - </w:t>
+      </w:r>
+      <w:r>
+        <w:t>Modo contraste “OLED”</w:t>
+      </w:r>
+    </w:p>
+    <w:p>
+      <w:pPr>
+        <w:keepNext/>
+        <w:jc w:val="center"/>
+      </w:pPr>
       <w:r>
         <w:rPr>
           <w:noProof/>
         </w:rPr>
-        <w:t>2</w:t>
-      </w:r>
-      <w:r>
-        <w:fldChar w:fldCharType="end"/>
-      </w:r>
-      <w:r>
-        <w:t xml:space="preserve"> - </w:t>
-      </w:r>
-      <w:r>
-        <w:t>Modo contraste “OLED”</w:t>
-      </w:r>
-    </w:p>
-    <w:p>
-      <w:pPr>
-        <w:keepNext/>
-        <w:jc w:val="center"/>
-      </w:pPr>
-      <w:r>
         <w:drawing>
           <wp:inline distT="0" distB="0" distL="0" distR="0" wp14:anchorId="72F43EB8" wp14:editId="1A5E5818">
             <wp:extent cx="4330800" cy="2880000"/>
@@ -8053,24 +8243,14 @@
       <w:r>
         <w:t xml:space="preserve">Ilustración </w:t>
       </w:r>
-      <w:r>
-        <w:fldChar w:fldCharType="begin"/>
-      </w:r>
-      <w:r>
-        <w:instrText xml:space="preserve"> SEQ Ilustración \* ARABIC </w:instrText>
-      </w:r>
-      <w:r>
-        <w:fldChar w:fldCharType="separate"/>
-      </w:r>
-      <w:r>
-        <w:rPr>
-          <w:noProof/>
-        </w:rPr>
-        <w:t>3</w:t>
-      </w:r>
-      <w:r>
-        <w:fldChar w:fldCharType="end"/>
-      </w:r>
+      <w:fldSimple w:instr=" SEQ Ilustración \* ARABIC ">
+        <w:r>
+          <w:rPr>
+            <w:noProof/>
+          </w:rPr>
+          <w:t>3</w:t>
+        </w:r>
+      </w:fldSimple>
       <w:r>
         <w:t xml:space="preserve"> - </w:t>
       </w:r>
@@ -8095,7 +8275,6 @@
           <w:szCs w:val="24"/>
         </w:rPr>
       </w:pPr>
-      <w:bookmarkStart w:id="19" w:name="_Toc232623080"/>
       <w:r>
         <w:br w:type="page"/>
       </w:r>
@@ -8104,11 +8283,12 @@
       <w:pPr>
         <w:pStyle w:val="Ttulo3"/>
       </w:pPr>
+      <w:bookmarkStart w:id="20" w:name="_Toc232682717"/>
       <w:r>
         <w:lastRenderedPageBreak/>
         <w:t>Correcciones y Optimización de la Interfaz</w:t>
       </w:r>
-      <w:bookmarkEnd w:id="19"/>
+      <w:bookmarkEnd w:id="20"/>
     </w:p>
     <w:p/>
     <w:p>
@@ -8136,11 +8316,11 @@
       <w:pPr>
         <w:pStyle w:val="Ttulo3"/>
       </w:pPr>
-      <w:bookmarkStart w:id="20" w:name="_Toc232623081"/>
+      <w:bookmarkStart w:id="21" w:name="_Toc232682718"/>
       <w:r>
         <w:t>Adaptación Responsive</w:t>
       </w:r>
-      <w:bookmarkEnd w:id="20"/>
+      <w:bookmarkEnd w:id="21"/>
     </w:p>
     <w:p/>
     <w:p>
@@ -8150,7 +8330,15 @@
     </w:p>
     <w:p>
       <w:r>
-        <w:t>Para ello se revisó el comportamiento de distintos elementos visuales en teléfonos móviles, tablets y computadoras, realizando ajustes que permitieran mantener una correcta distribución del contenido y preservar la legibilidad de la información presentada.</w:t>
+        <w:t xml:space="preserve">Para ello se revisó el comportamiento de distintos elementos visuales en teléfonos móviles, </w:t>
+      </w:r>
+      <w:proofErr w:type="spellStart"/>
+      <w:r>
+        <w:t>tablets</w:t>
+      </w:r>
+      <w:proofErr w:type="spellEnd"/>
+      <w:r>
+        <w:t xml:space="preserve"> y computadoras, realizando ajustes que permitieran mantener una correcta distribución del contenido y preservar la legibilidad de la información presentada.</w:t>
       </w:r>
     </w:p>
     <w:p>
@@ -8168,11 +8356,11 @@
       <w:pPr>
         <w:pStyle w:val="Ttulo2"/>
       </w:pPr>
-      <w:bookmarkStart w:id="21" w:name="_Toc232623082"/>
+      <w:bookmarkStart w:id="22" w:name="_Toc232682719"/>
       <w:r>
         <w:t>Implementación como Progressive Web App</w:t>
       </w:r>
-      <w:bookmarkEnd w:id="21"/>
+      <w:bookmarkEnd w:id="22"/>
     </w:p>
     <w:p/>
     <w:p>
@@ -8190,11 +8378,11 @@
       <w:pPr>
         <w:pStyle w:val="Ttulo3"/>
       </w:pPr>
-      <w:bookmarkStart w:id="22" w:name="_Toc232623083"/>
+      <w:bookmarkStart w:id="23" w:name="_Toc232682720"/>
       <w:r>
         <w:t>Objetivos de la conversión a PWA</w:t>
       </w:r>
-      <w:bookmarkEnd w:id="22"/>
+      <w:bookmarkEnd w:id="23"/>
     </w:p>
     <w:p/>
     <w:p>
@@ -8221,11 +8409,11 @@
           <w:lang w:val="es-ES"/>
         </w:rPr>
       </w:pPr>
-      <w:bookmarkStart w:id="23" w:name="_Toc232623084"/>
+      <w:bookmarkStart w:id="24" w:name="_Toc232682721"/>
       <w:r>
         <w:t>Implementación del Web App Manifest</w:t>
       </w:r>
-      <w:bookmarkEnd w:id="23"/>
+      <w:bookmarkEnd w:id="24"/>
     </w:p>
     <w:p/>
     <w:p>
@@ -8249,6 +8437,9 @@
         <w:jc w:val="center"/>
       </w:pPr>
       <w:r>
+        <w:rPr>
+          <w:noProof/>
+        </w:rPr>
         <w:drawing>
           <wp:inline distT="0" distB="0" distL="0" distR="0" wp14:anchorId="06F5D80E" wp14:editId="11C53B62">
             <wp:extent cx="3406435" cy="1386960"/>
@@ -8301,38 +8492,29 @@
       <w:r>
         <w:t xml:space="preserve">Ilustración </w:t>
       </w:r>
-      <w:r>
-        <w:fldChar w:fldCharType="begin"/>
-      </w:r>
-      <w:r>
-        <w:instrText xml:space="preserve"> SEQ Ilustración \* ARABIC </w:instrText>
-      </w:r>
-      <w:r>
-        <w:fldChar w:fldCharType="separate"/>
-      </w:r>
+      <w:fldSimple w:instr=" SEQ Ilustración \* ARABIC ">
+        <w:r>
+          <w:rPr>
+            <w:noProof/>
+          </w:rPr>
+          <w:t>4</w:t>
+        </w:r>
+      </w:fldSimple>
+      <w:r>
+        <w:t xml:space="preserve"> - </w:t>
+      </w:r>
+      <w:r>
+        <w:t>Pop up en el navegador solicitando permiso para instalar</w:t>
+      </w:r>
+    </w:p>
+    <w:p>
+      <w:pPr>
+        <w:keepNext/>
+        <w:jc w:val="center"/>
+      </w:pPr>
       <w:r>
         <w:rPr>
           <w:noProof/>
-        </w:rPr>
-        <w:t>4</w:t>
-      </w:r>
-      <w:r>
-        <w:fldChar w:fldCharType="end"/>
-      </w:r>
-      <w:r>
-        <w:t xml:space="preserve"> - </w:t>
-      </w:r>
-      <w:r>
-        <w:t>Pop up en el navegador solicitando permiso para instalar</w:t>
-      </w:r>
-    </w:p>
-    <w:p>
-      <w:pPr>
-        <w:keepNext/>
-        <w:jc w:val="center"/>
-      </w:pPr>
-      <w:r>
-        <w:rPr>
           <w:color w:val="767171" w:themeColor="background2" w:themeShade="80"/>
           <w:sz w:val="20"/>
           <w:szCs w:val="20"/>
@@ -8389,39 +8571,30 @@
       <w:r>
         <w:t xml:space="preserve">Ilustración </w:t>
       </w:r>
-      <w:r>
-        <w:fldChar w:fldCharType="begin"/>
-      </w:r>
-      <w:r>
-        <w:instrText xml:space="preserve"> SEQ Ilustración \* ARABIC </w:instrText>
-      </w:r>
-      <w:r>
-        <w:fldChar w:fldCharType="separate"/>
-      </w:r>
+      <w:fldSimple w:instr=" SEQ Ilustración \* ARABIC ">
+        <w:r>
+          <w:rPr>
+            <w:noProof/>
+          </w:rPr>
+          <w:t>5</w:t>
+        </w:r>
+      </w:fldSimple>
+      <w:r>
+        <w:t xml:space="preserve"> - </w:t>
+      </w:r>
+      <w:r>
+        <w:t>Acceso directo generado en Windows</w:t>
+      </w:r>
+    </w:p>
+    <w:p/>
+    <w:p>
+      <w:pPr>
+        <w:keepNext/>
+        <w:jc w:val="center"/>
+      </w:pPr>
       <w:r>
         <w:rPr>
           <w:noProof/>
-        </w:rPr>
-        <w:t>5</w:t>
-      </w:r>
-      <w:r>
-        <w:fldChar w:fldCharType="end"/>
-      </w:r>
-      <w:r>
-        <w:t xml:space="preserve"> - </w:t>
-      </w:r>
-      <w:r>
-        <w:t>Acceso directo generado en Windows</w:t>
-      </w:r>
-    </w:p>
-    <w:p/>
-    <w:p>
-      <w:pPr>
-        <w:keepNext/>
-        <w:jc w:val="center"/>
-      </w:pPr>
-      <w:r>
-        <w:rPr>
           <w:color w:val="767171" w:themeColor="background2" w:themeShade="80"/>
           <w:sz w:val="20"/>
           <w:szCs w:val="20"/>
@@ -8478,24 +8651,14 @@
       <w:r>
         <w:t xml:space="preserve">Ilustración </w:t>
       </w:r>
-      <w:r>
-        <w:fldChar w:fldCharType="begin"/>
-      </w:r>
-      <w:r>
-        <w:instrText xml:space="preserve"> SEQ Ilustración \* ARABIC </w:instrText>
-      </w:r>
-      <w:r>
-        <w:fldChar w:fldCharType="separate"/>
-      </w:r>
-      <w:r>
-        <w:rPr>
-          <w:noProof/>
-        </w:rPr>
-        <w:t>6</w:t>
-      </w:r>
-      <w:r>
-        <w:fldChar w:fldCharType="end"/>
-      </w:r>
+      <w:fldSimple w:instr=" SEQ Ilustración \* ARABIC ">
+        <w:r>
+          <w:rPr>
+            <w:noProof/>
+          </w:rPr>
+          <w:t>6</w:t>
+        </w:r>
+      </w:fldSimple>
       <w:r>
         <w:t xml:space="preserve"> - </w:t>
       </w:r>
@@ -8508,11 +8671,11 @@
       <w:pPr>
         <w:pStyle w:val="Ttulo3"/>
       </w:pPr>
-      <w:bookmarkStart w:id="24" w:name="_Toc232623085"/>
+      <w:bookmarkStart w:id="25" w:name="_Toc232682722"/>
       <w:r>
         <w:t>Incorporación de Service Workers</w:t>
       </w:r>
-      <w:bookmarkEnd w:id="24"/>
+      <w:bookmarkEnd w:id="25"/>
     </w:p>
     <w:p/>
     <w:p>
@@ -8533,10 +8696,7 @@
         <w:t xml:space="preserve">tecnología </w:t>
       </w:r>
       <w:r>
-        <w:t>(Safari y Chrome principalmente)</w:t>
-      </w:r>
-      <w:r>
-        <w:t>.</w:t>
+        <w:t>(Safari y Chrome principalmente).</w:t>
       </w:r>
     </w:p>
     <w:p/>
@@ -8544,11 +8704,11 @@
       <w:pPr>
         <w:pStyle w:val="Ttulo3"/>
       </w:pPr>
-      <w:bookmarkStart w:id="25" w:name="_Toc232623086"/>
+      <w:bookmarkStart w:id="26" w:name="_Toc232682723"/>
       <w:r>
         <w:t>Validación en diferentes plataformas</w:t>
       </w:r>
-      <w:bookmarkEnd w:id="25"/>
+      <w:bookmarkEnd w:id="26"/>
     </w:p>
     <w:p/>
     <w:p>
@@ -8634,24 +8794,14 @@
       <w:r>
         <w:t xml:space="preserve">Ilustración </w:t>
       </w:r>
-      <w:r>
-        <w:fldChar w:fldCharType="begin"/>
-      </w:r>
-      <w:r>
-        <w:instrText xml:space="preserve"> SEQ Ilustración \* ARABIC </w:instrText>
-      </w:r>
-      <w:r>
-        <w:fldChar w:fldCharType="separate"/>
-      </w:r>
-      <w:r>
-        <w:rPr>
-          <w:noProof/>
-        </w:rPr>
-        <w:t>7</w:t>
-      </w:r>
-      <w:r>
-        <w:fldChar w:fldCharType="end"/>
-      </w:r>
+      <w:fldSimple w:instr=" SEQ Ilustración \* ARABIC ">
+        <w:r>
+          <w:rPr>
+            <w:noProof/>
+          </w:rPr>
+          <w:t>7</w:t>
+        </w:r>
+      </w:fldSimple>
       <w:r>
         <w:t xml:space="preserve"> - </w:t>
       </w:r>
@@ -8739,24 +8889,14 @@
       <w:r>
         <w:t xml:space="preserve">Ilustración </w:t>
       </w:r>
-      <w:r>
-        <w:fldChar w:fldCharType="begin"/>
-      </w:r>
-      <w:r>
-        <w:instrText xml:space="preserve"> SEQ Ilustración \* ARABIC </w:instrText>
-      </w:r>
-      <w:r>
-        <w:fldChar w:fldCharType="separate"/>
-      </w:r>
-      <w:r>
-        <w:rPr>
-          <w:noProof/>
-        </w:rPr>
-        <w:t>8</w:t>
-      </w:r>
-      <w:r>
-        <w:fldChar w:fldCharType="end"/>
-      </w:r>
+      <w:fldSimple w:instr=" SEQ Ilustración \* ARABIC ">
+        <w:r>
+          <w:rPr>
+            <w:noProof/>
+          </w:rPr>
+          <w:t>8</w:t>
+        </w:r>
+      </w:fldSimple>
       <w:r>
         <w:t xml:space="preserve"> - </w:t>
       </w:r>
@@ -8937,11 +9077,11 @@
       <w:pPr>
         <w:pStyle w:val="Ttulo3"/>
       </w:pPr>
-      <w:bookmarkStart w:id="26" w:name="_Toc232623087"/>
+      <w:bookmarkStart w:id="27" w:name="_Toc232682724"/>
       <w:r>
         <w:t>Resultados obtenidos</w:t>
       </w:r>
-      <w:bookmarkEnd w:id="26"/>
+      <w:bookmarkEnd w:id="27"/>
     </w:p>
     <w:p/>
     <w:p>
@@ -8951,13 +9091,7 @@
     </w:p>
     <w:p>
       <w:r>
-        <w:t>Como resultado, los usuarios pueden instalar la aplicación de manera similar a una aplicación convencional, acceder a ella mediante accesos directos dedicados y utilizar una interfaz integrada con el sistema operativo, mejorando significativamente la experiencia general de utilización</w:t>
-      </w:r>
-      <w:r>
-        <w:t xml:space="preserve"> y evitando tener que recordar direcciones IP y número de puerto</w:t>
-      </w:r>
-      <w:r>
-        <w:t>.</w:t>
+        <w:t>Como resultado, los usuarios pueden instalar la aplicación de manera similar a una aplicación convencional, acceder a ella mediante accesos directos dedicados y utilizar una interfaz integrada con el sistema operativo, mejorando significativamente la experiencia general de utilización y evitando tener que recordar direcciones IP y número de puerto.</w:t>
       </w:r>
     </w:p>
     <w:p/>
@@ -8966,11 +9100,11 @@
       <w:pPr>
         <w:pStyle w:val="Ttulo2"/>
       </w:pPr>
-      <w:bookmarkStart w:id="27" w:name="_Toc232623088"/>
+      <w:bookmarkStart w:id="28" w:name="_Toc232682725"/>
       <w:r>
         <w:t>Integración y Validación</w:t>
       </w:r>
-      <w:bookmarkEnd w:id="27"/>
+      <w:bookmarkEnd w:id="28"/>
     </w:p>
     <w:p/>
     <w:p>
@@ -8988,12 +9122,12 @@
       <w:pPr>
         <w:pStyle w:val="Ttulo3"/>
       </w:pPr>
-      <w:bookmarkStart w:id="28" w:name="_Toc232623089"/>
+      <w:bookmarkStart w:id="29" w:name="_Toc232682726"/>
       <w:r>
         <w:lastRenderedPageBreak/>
         <w:t>Integración con el Backend</w:t>
       </w:r>
-      <w:bookmarkEnd w:id="28"/>
+      <w:bookmarkEnd w:id="29"/>
     </w:p>
     <w:p/>
     <w:p>
@@ -9016,11 +9150,11 @@
       <w:pPr>
         <w:pStyle w:val="Ttulo3"/>
       </w:pPr>
-      <w:bookmarkStart w:id="29" w:name="_Toc232623090"/>
+      <w:bookmarkStart w:id="30" w:name="_Toc232682727"/>
       <w:r>
         <w:t>Pruebas Funcionales</w:t>
       </w:r>
-      <w:bookmarkEnd w:id="29"/>
+      <w:bookmarkEnd w:id="30"/>
     </w:p>
     <w:p/>
     <w:p>
@@ -9043,11 +9177,11 @@
       <w:pPr>
         <w:pStyle w:val="Ttulo3"/>
       </w:pPr>
-      <w:bookmarkStart w:id="30" w:name="_Toc232623091"/>
+      <w:bookmarkStart w:id="31" w:name="_Toc232682728"/>
       <w:r>
         <w:t>Pruebas Multiplataforma</w:t>
       </w:r>
-      <w:bookmarkEnd w:id="30"/>
+      <w:bookmarkEnd w:id="31"/>
     </w:p>
     <w:p/>
     <w:p>
@@ -9108,11 +9242,11 @@
       <w:pPr>
         <w:pStyle w:val="Ttulo3"/>
       </w:pPr>
-      <w:bookmarkStart w:id="31" w:name="_Toc232623092"/>
+      <w:bookmarkStart w:id="32" w:name="_Toc232682729"/>
       <w:r>
         <w:t>Corrección y Estabilización</w:t>
       </w:r>
-      <w:bookmarkEnd w:id="31"/>
+      <w:bookmarkEnd w:id="32"/>
     </w:p>
     <w:p/>
     <w:p>
@@ -9142,11 +9276,11 @@
       <w:pPr>
         <w:pStyle w:val="Ttulo3"/>
       </w:pPr>
-      <w:bookmarkStart w:id="32" w:name="_Toc232623093"/>
+      <w:bookmarkStart w:id="33" w:name="_Toc232682730"/>
       <w:r>
         <w:t>Resultado de las Validaciones</w:t>
       </w:r>
-      <w:bookmarkEnd w:id="32"/>
+      <w:bookmarkEnd w:id="33"/>
     </w:p>
     <w:p/>
     <w:p>
@@ -9169,11 +9303,11 @@
       <w:pPr>
         <w:pStyle w:val="Ttulo2"/>
       </w:pPr>
-      <w:bookmarkStart w:id="33" w:name="_Toc232623094"/>
+      <w:bookmarkStart w:id="34" w:name="_Toc232682731"/>
       <w:r>
         <w:t>Resultados Obtenidos</w:t>
       </w:r>
-      <w:bookmarkEnd w:id="33"/>
+      <w:bookmarkEnd w:id="34"/>
     </w:p>
     <w:p/>
     <w:p>
@@ -9222,11 +9356,11 @@
       <w:pPr>
         <w:pStyle w:val="Ttulo2"/>
       </w:pPr>
-      <w:bookmarkStart w:id="34" w:name="_Toc232623095"/>
+      <w:bookmarkStart w:id="35" w:name="_Toc232682732"/>
       <w:r>
         <w:t>Conclusiones</w:t>
       </w:r>
-      <w:bookmarkEnd w:id="34"/>
+      <w:bookmarkEnd w:id="35"/>
     </w:p>
     <w:p/>
     <w:p>
@@ -11168,6 +11302,7 @@
   <w:style w:type="character" w:default="1" w:styleId="Fuentedeprrafopredeter">
     <w:name w:val="Default Paragraph Font"/>
     <w:uiPriority w:val="1"/>
+    <w:semiHidden/>
     <w:unhideWhenUsed/>
   </w:style>
   <w:style w:type="table" w:default="1" w:styleId="Tablanormal">

</xml_diff>